<commit_message>
Add/update resource data for AquiferOpenStudyNotesThemes
</commit_message>
<xml_diff>
--- a/arb/docx/001.content.docx
+++ b/arb/docx/001.content.docx
@@ -163,28 +163,6 @@
           <w:lang w:val="ar_AE" w:bidi="ar_AE"/>
         </w:rPr>
         <w:t>ا</w:t>
-      </w:r>
-      <w:r>
-        <w:rPr>
-          <w:lang w:val="ar_AE" w:bidi="ar_AE"/>
-        </w:rPr>
-      </w:r>
-    </w:p>
-    <w:p>
-      <w:pPr>
-        <w:bidi/>
-      </w:pPr>
-      <w:r>
-        <w:rPr>
-          <w:lang w:val="ar_AE" w:bidi="ar_AE"/>
-        </w:rPr>
-      </w:r>
-      <w:r>
-        <w:rPr>
-          <w:i/>
-          <w:lang w:val="ar_AE" w:bidi="ar_AE"/>
-        </w:rPr>
-        <w:t>"الإيمان" في إنجيل يوحنا, "أنا هو" أقوال يسوع, ابن الإنسان, ابن الله, احتفال, اختيار الحياة أو الموت, أخطار الخطية وأهوالها, أدوار النساء في كنيسة العهد الجديد, أربع إمبراطوريات عالمية, أرض الموعد, إزالة الشر, أسئلة وشكوك, استدعاء أرواح الموتى, اسم الله على هيكله, اضطهاد شعب ٱلله, إعادة بناء أورشليم, اكتمال الهيكل الثاني, الآباء والأبناء, الآيات المعجزية في إنجيل يوحنّا, الأبرار يعانون, الأدب الرؤيويّ الأخرويّ (أبوغلمسيس/ أبوكلبسيس), الارتداد, الارتداد والتجديد, الأرض, الأرقام الرمزيّة, الاستمتاع بعطايا الله, الاضطهاد, الإعلان العام في الطبيعة, الأغنياء والمساكين في إنجيل لوقا, الأفعال النبوية (الرمزية), الإله المجهول, الأمان والطاعة, الأمور الأخيرة ومؤمنو تسالونيكي, الأنبياء الكذبة, الأنبياء في سفر الملوك الأول, الانتماء إلى المسيح (تبعية المسيح), الاهتمام بالفقراء, الإيمان, الإيمان والأعمال الصالحة, أمانة ٱلله تجاه شعبه, انتهاك المقدَّسات, انهيار الثقافة, أورشليم, إيمان قليل, ٱلله بصفته المحارب القدوس</w:t>
       </w:r>
       <w:r>
         <w:rPr>

</xml_diff>

<commit_message>
Update AquiferOpenStudyNotesThemes for 2026-07-14 release
</commit_message>
<xml_diff>
--- a/arb/docx/001.content.docx
+++ b/arb/docx/001.content.docx
@@ -22,7 +22,7 @@
         <w:rPr>
           <w:lang w:val="ar_AE" w:bidi="ar_AE"/>
         </w:rPr>
-        <w:t>Resource: Tyndale Open Study Notes</w:t>
+        <w:t>Resource: Aquifer Open Study Notes (Themes)</w:t>
       </w:r>
       <w:r>
         <w:rPr>
@@ -122,7 +122,7 @@
         <w:rPr>
           <w:lang w:val="ar_AE" w:bidi="ar_AE"/>
         </w:rPr>
-        <w:t>Tyndale Open Study Notes</w:t>
+        <w:t>Aquifer Open Study Notes (Themes)</w:t>
       </w:r>
     </w:p>
     <w:p>

</xml_diff>